<commit_message>
Figures: move explanations and point values from the plots into the captions
Figure 1 panel letters only (O8 by its ring); no in-plot titles/footers in
Figures 2-3; no E_F in Figure 4/S2 panel labels; no point labels or sums in S1.
Captions in the upload copies carry the moved information. Masters unchanged.

Co-Authored-By: Claude Opus 5.5 <noreply@anthropic.com>
Claude-Session: https://claude.ai/code/session_011m1nWiFCs4xdp8CXy2DSzu
</commit_message>
<xml_diff>
--- a/DFT_paper_revision/USER_19OCT_FIGFIX/6_Supporting_Information.docx
+++ b/DFT_paper_revision/USER_19OCT_FIGFIX/6_Supporting_Information.docx
@@ -525,7 +525,7 @@
           <w:iCs/>
           <w:i/>
         </w:rPr>
-        <w:t xml:space="preserve">Figure S1. Löwdin spin polarisation of every atom of the Rb_VO cell against its minimum-image distance from Rb (projwfc.x, 2×2×2 non-self-consistent run on the relaxed cell). Red circles: O; blue squares: Ti; green diamond: Rb. Symmetry-equivalent pairs (identical distance and moment) are labelled together.</w:t>
+        <w:t xml:space="preserve">Figure S1. Löwdin spin polarisation of every atom of the Rb_VO cell against its minimum-image distance from Rb (projwfc.x, 2×2×2 non-self-consistent run on the relaxed cell). Red circles: O; blue squares: Ti; green diamond: Rb. The largest moment, +0.59 μB, is on O8 at 2.56 Å from Rb; the symmetry-equivalent O6 and O17 (3.26 Å) carry +0.11 μB each, and Ti4 and Ti15 −0.03 μB each. The site moments sum to +1.01 μB (sum of magnitudes 1.24 μB).</w:t>
       </w:r>
     </w:p>
     <w:p>
@@ -656,7 +656,7 @@
           <w:iCs/>
           <w:i/>
         </w:rPr>
-        <w:t xml:space="preserve">Figure S2. Projected densities of states of (a) Pr_VO and (b) Rb_VO without spin decomposition (same runs and settings as Figure 4). Filled blue: Ti-3d; red: O-2p; orange (dashed): Pr-5d ×5 (Pr_VO only); grey: total.</w:t>
+        <w:t xml:space="preserve">Figure S2. Projected densities of states of (a) Pr_VO and (b) Rb_VO without spin decomposition (same runs and settings as Figure 4; Fermi energies 10.31 eV for Pr_VO and 7.14 eV for Rb_VO). Filled blue: Ti-3d; red: O-2p; orange (dashed): Pr-5d ×5 (Pr_VO only); grey: total.</w:t>
       </w:r>
     </w:p>
     <w:bookmarkEnd w:id="27"/>

</xml_diff>